<commit_message>
Updated the User Manual to be more detailed
</commit_message>
<xml_diff>
--- a/User Manual.docx
+++ b/User Manual.docx
@@ -1,88 +1,475 @@
 
 <file path=word/document.xml><?xml version="1.0" encoding="utf-8"?>
-<w:document xmlns:wpc="http://schemas.microsoft.com/office/word/2010/wordprocessingCanvas" xmlns:mc="http://schemas.openxmlformats.org/markup-compatibility/2006" xmlns:o="urn:schemas-microsoft-com:office:office" xmlns:r="http://schemas.openxmlformats.org/officeDocument/2006/relationships" xmlns:m="http://schemas.openxmlformats.org/officeDocument/2006/math" xmlns:v="urn:schemas-microsoft-com:vml" xmlns:wp14="http://schemas.microsoft.com/office/word/2010/wordprocessingDrawing" xmlns:wp="http://schemas.openxmlformats.org/drawingml/2006/wordprocessingDrawing" xmlns:w10="urn:schemas-microsoft-com:office:word" xmlns:w="http://schemas.openxmlformats.org/wordprocessingml/2006/main" xmlns:w14="http://schemas.microsoft.com/office/word/2010/wordml" xmlns:w15="http://schemas.microsoft.com/office/word/2012/wordml" xmlns:wpg="http://schemas.microsoft.com/office/word/2010/wordprocessingGroup" xmlns:wpi="http://schemas.microsoft.com/office/word/2010/wordprocessingInk" xmlns:wne="http://schemas.microsoft.com/office/word/2006/wordml" xmlns:wps="http://schemas.microsoft.com/office/word/2010/wordprocessingShape" xmlns:w16se="http://schemas.microsoft.com/office/word/2015/wordml/symex" xmlns:w16cid="http://schemas.microsoft.com/office/word/2016/wordml/cid" xmlns:w16="http://schemas.microsoft.com/office/word/2018/wordml" xmlns:w16cex="http://schemas.microsoft.com/office/word/2018/wordml/cex" xmlns:w16sdtdh="http://schemas.microsoft.com/office/word/2020/wordml/sdtdatahash" xmlns:w16sdtfl="http://schemas.microsoft.com/office/word/2024/wordml/sdtformatlock" mc:Ignorable="w14 w15 wp14 w16se w16cid w16 w16cex w16sdtdh w16sdtfl">
+<w:document xmlns:wpc="http://schemas.microsoft.com/office/word/2010/wordprocessingCanvas" xmlns:cx="http://schemas.microsoft.com/office/drawing/2014/chartex" xmlns:cx1="http://schemas.microsoft.com/office/drawing/2015/9/8/chartex" xmlns:cx2="http://schemas.microsoft.com/office/drawing/2015/10/21/chartex" xmlns:cx3="http://schemas.microsoft.com/office/drawing/2016/5/9/chartex" xmlns:cx4="http://schemas.microsoft.com/office/drawing/2016/5/10/chartex" xmlns:cx5="http://schemas.microsoft.com/office/drawing/2016/5/11/chartex" xmlns:cx6="http://schemas.microsoft.com/office/drawing/2016/5/12/chartex" xmlns:cx7="http://schemas.microsoft.com/office/drawing/2016/5/13/chartex" xmlns:cx8="http://schemas.microsoft.com/office/drawing/2016/5/14/chartex" xmlns:mc="http://schemas.openxmlformats.org/markup-compatibility/2006" xmlns:aink="http://schemas.microsoft.com/office/drawing/2016/ink" xmlns:am3d="http://schemas.microsoft.com/office/drawing/2017/model3d" xmlns:o="urn:schemas-microsoft-com:office:office" xmlns:oel="http://schemas.microsoft.com/office/2019/extlst" xmlns:r="http://schemas.openxmlformats.org/officeDocument/2006/relationships" xmlns:m="http://schemas.openxmlformats.org/officeDocument/2006/math" xmlns:v="urn:schemas-microsoft-com:vml" xmlns:wp14="http://schemas.microsoft.com/office/word/2010/wordprocessingDrawing" xmlns:wp="http://schemas.openxmlformats.org/drawingml/2006/wordprocessingDrawing" xmlns:w10="urn:schemas-microsoft-com:office:word" xmlns:w="http://schemas.openxmlformats.org/wordprocessingml/2006/main" xmlns:w14="http://schemas.microsoft.com/office/word/2010/wordml" xmlns:w15="http://schemas.microsoft.com/office/word/2012/wordml" xmlns:w16cex="http://schemas.microsoft.com/office/word/2018/wordml/cex" xmlns:w16cid="http://schemas.microsoft.com/office/word/2016/wordml/cid" xmlns:w16="http://schemas.microsoft.com/office/word/2018/wordml" xmlns:w16du="http://schemas.microsoft.com/office/word/2023/wordml/word16du" xmlns:w16sdtdh="http://schemas.microsoft.com/office/word/2020/wordml/sdtdatahash" xmlns:w16sdtfl="http://schemas.microsoft.com/office/word/2024/wordml/sdtformatlock" xmlns:w16se="http://schemas.microsoft.com/office/word/2015/wordml/symex" xmlns:wpg="http://schemas.microsoft.com/office/word/2010/wordprocessingGroup" xmlns:wpi="http://schemas.microsoft.com/office/word/2010/wordprocessingInk" xmlns:wne="http://schemas.microsoft.com/office/word/2006/wordml" xmlns:wps="http://schemas.microsoft.com/office/word/2010/wordprocessingShape" mc:Ignorable="w14 w15 w16se w16cid w16 w16cex w16sdtdh w16sdtfl w16du wp14">
   <w:body>
     <w:p>
       <w:pPr>
         <w:pStyle w:val="Title"/>
         <w:jc w:val="center"/>
       </w:pPr>
-      <w:r>
-        <w:rPr/>
+    </w:p>
+    <w:p/>
+    <w:p/>
+    <w:p/>
+    <w:p/>
+    <w:p/>
+    <w:p/>
+    <w:p/>
+    <w:p/>
+    <w:p/>
+    <w:p>
+      <w:pPr>
+        <w:pStyle w:val="Title"/>
+        <w:jc w:val="center"/>
+      </w:pPr>
+      <w:r>
         <w:t>Gourmet Gateway User Manual</w:t>
       </w:r>
     </w:p>
     <w:p>
       <w:pPr>
-        <w:pStyle w:val="Normal"/>
-      </w:pPr>
-      <w:r>
-        <w:rPr/>
-        <w:t xml:space="preserve">When the program runs it will show </w:t>
-      </w:r>
-      <w:r>
-        <w:rPr/>
-        <w:t xml:space="preserve">a menu showing items such as </w:t>
-      </w:r>
-      <w:r>
-        <w:rPr/>
-        <w:t xml:space="preserve">drinks, burgers, fries </w:t>
-      </w:r>
-      <w:r>
-        <w:rPr/>
-        <w:t>etc...,</w:t>
-      </w:r>
-      <w:r>
-        <w:rPr/>
-        <w:t xml:space="preserve"> users can make selections by </w:t>
-      </w:r>
-      <w:r>
-        <w:rPr/>
-        <w:t>pressing the number 1,2,3,4</w:t>
-      </w:r>
-      <w:r>
-        <w:rPr/>
-        <w:t xml:space="preserve"> or </w:t>
-      </w:r>
-      <w:r>
-        <w:rPr/>
-        <w:t xml:space="preserve">5 to select then </w:t>
-      </w:r>
-      <w:r>
-        <w:rPr/>
-        <w:t>1,2 or 3</w:t>
-      </w:r>
-      <w:r>
-        <w:rPr/>
-        <w:t xml:space="preserve"> to select a size/amount, after this you can select another </w:t>
-      </w:r>
-      <w:r>
-        <w:rPr/>
-        <w:t xml:space="preserve">item on the menu and its size/amount or hit the 5 number key to end the </w:t>
-      </w:r>
-      <w:r>
-        <w:rPr/>
-        <w:t xml:space="preserve">ordering process. </w:t>
-      </w:r>
-      <w:r>
-        <w:rPr/>
-        <w:t xml:space="preserve">Then </w:t>
-      </w:r>
-      <w:r>
-        <w:rPr/>
-        <w:t xml:space="preserve">the program </w:t>
-      </w:r>
-      <w:r>
-        <w:rPr/>
-        <w:t>will show you the total bill</w:t>
-      </w:r>
-      <w:r>
-        <w:rPr/>
+        <w:jc w:val="center"/>
+      </w:pPr>
+      <w:r>
+        <w:t>SDEV230, Fall 2025</w:t>
+      </w:r>
+    </w:p>
+    <w:p>
+      <w:pPr>
+        <w:jc w:val="center"/>
+      </w:pPr>
+      <w:r>
+        <w:t>Group C</w:t>
+      </w:r>
+    </w:p>
+    <w:p/>
+    <w:p/>
+    <w:p/>
+    <w:p/>
+    <w:p/>
+    <w:p/>
+    <w:p/>
+    <w:p/>
+    <w:p/>
+    <w:p/>
+    <w:p/>
+    <w:p/>
+    <w:p>
+      <w:pPr>
+        <w:rPr>
+          <w:b/>
+          <w:bCs/>
+        </w:rPr>
+      </w:pPr>
+      <w:r>
+        <w:rPr>
+          <w:b/>
+          <w:bCs/>
+        </w:rPr>
+        <w:lastRenderedPageBreak/>
+        <w:t>Introduction</w:t>
+      </w:r>
+    </w:p>
+    <w:p>
+      <w:r>
+        <w:t xml:space="preserve">This document is intended to provide instructions for the Gourmet Gateway </w:t>
+      </w:r>
+      <w:r>
+        <w:t xml:space="preserve">Ordering Application. This application is meant </w:t>
+      </w:r>
+      <w:r>
+        <w:t xml:space="preserve">for restaurants of any kind to easily </w:t>
+      </w:r>
+      <w:r>
+        <w:t xml:space="preserve">implement a more automated ordering system for their business. </w:t>
+      </w:r>
+    </w:p>
+    <w:p>
+      <w:r>
+        <w:t>The Gourmet Gateway User Documentation document contains the following information:</w:t>
+      </w:r>
+    </w:p>
+    <w:p>
+      <w:pPr>
+        <w:pStyle w:val="ListParagraph"/>
+        <w:numPr>
+          <w:ilvl w:val="0"/>
+          <w:numId w:val="1"/>
+        </w:numPr>
+      </w:pPr>
+      <w:r>
+        <w:t>Instructions for setting up the menu for the application</w:t>
+      </w:r>
+    </w:p>
+    <w:p>
+      <w:pPr>
+        <w:pStyle w:val="ListParagraph"/>
+        <w:numPr>
+          <w:ilvl w:val="0"/>
+          <w:numId w:val="1"/>
+        </w:numPr>
+      </w:pPr>
+      <w:r>
+        <w:t xml:space="preserve">Instructions for </w:t>
+      </w:r>
+      <w:r>
+        <w:t>using the application and making an order</w:t>
+      </w:r>
+    </w:p>
+    <w:p>
+      <w:pPr>
+        <w:pStyle w:val="ListParagraph"/>
+        <w:numPr>
+          <w:ilvl w:val="0"/>
+          <w:numId w:val="1"/>
+        </w:numPr>
+      </w:pPr>
+      <w:r>
+        <w:t>Retrieving the order when it has been submitted</w:t>
+      </w:r>
+    </w:p>
+    <w:p/>
+    <w:p/>
+    <w:p/>
+    <w:p/>
+    <w:p/>
+    <w:p/>
+    <w:p/>
+    <w:p/>
+    <w:p/>
+    <w:p/>
+    <w:p/>
+    <w:p/>
+    <w:p/>
+    <w:p/>
+    <w:p/>
+    <w:p/>
+    <w:p/>
+    <w:p/>
+    <w:p/>
+    <w:p>
+      <w:pPr>
+        <w:rPr>
+          <w:b/>
+          <w:bCs/>
+        </w:rPr>
+      </w:pPr>
+      <w:r>
+        <w:rPr>
+          <w:b/>
+          <w:bCs/>
+        </w:rPr>
+        <w:lastRenderedPageBreak/>
+        <w:t>Setting Up the Menu</w:t>
+      </w:r>
+    </w:p>
+    <w:p>
+      <w:r>
+        <w:t>To set up the menu for the Gourmet Gateway application,</w:t>
+      </w:r>
+      <w:r>
+        <w:t xml:space="preserve"> you will need to</w:t>
+      </w:r>
+      <w:r>
+        <w:t xml:space="preserve"> edit the </w:t>
+      </w:r>
+      <w:r>
+        <w:t>“menu.txt” file (or create if not found) in the same directory of the application.</w:t>
+      </w:r>
+      <w:r>
+        <w:t xml:space="preserve"> </w:t>
+      </w:r>
+      <w:r>
+        <w:t xml:space="preserve">The format </w:t>
+      </w:r>
+      <w:r>
+        <w:t>for the menu</w:t>
+      </w:r>
+      <w:r>
+        <w:t xml:space="preserve"> file</w:t>
+      </w:r>
+      <w:r>
+        <w:t xml:space="preserve"> is </w:t>
+      </w:r>
+      <w:r>
+        <w:t>simple</w:t>
+      </w:r>
+      <w:r>
         <w:t>.</w:t>
       </w:r>
     </w:p>
+    <w:p>
+      <w:r>
+        <w:t xml:space="preserve">To add an item to the menu, simply type </w:t>
+      </w:r>
+      <w:r>
+        <w:t xml:space="preserve">a </w:t>
+      </w:r>
+      <w:r>
+        <w:t>hyphen</w:t>
+      </w:r>
+      <w:r>
+        <w:t xml:space="preserve"> </w:t>
+      </w:r>
+      <w:r>
+        <w:t>directly</w:t>
+      </w:r>
+      <w:r>
+        <w:t xml:space="preserve"> followed by the name of the item you want displayed.</w:t>
+      </w:r>
+      <w:r>
+        <w:t xml:space="preserve"> For example:</w:t>
+      </w:r>
+    </w:p>
+    <w:p>
+      <w:pPr>
+        <w:rPr>
+          <w:i/>
+          <w:iCs/>
+        </w:rPr>
+      </w:pPr>
+      <w:r>
+        <w:rPr>
+          <w:i/>
+          <w:iCs/>
+        </w:rPr>
+        <w:t>-Burger</w:t>
+      </w:r>
+    </w:p>
+    <w:p>
+      <w:r>
+        <w:t xml:space="preserve">Then, </w:t>
+      </w:r>
+      <w:r>
+        <w:t>following</w:t>
+      </w:r>
+      <w:r>
+        <w:t xml:space="preserve"> the line after the item, you must add one or more options for the user to select. </w:t>
+      </w:r>
+      <w:r>
+        <w:t>The option names should be typed on the first line, separated by spaces. The option names are not allowed to have spaces in them, so try to keep them one word, or use hyphens</w:t>
+      </w:r>
+      <w:r>
+        <w:t xml:space="preserve"> to separate words</w:t>
+      </w:r>
+      <w:r>
+        <w:t>.</w:t>
+      </w:r>
+      <w:r>
+        <w:t xml:space="preserve"> On the line directly following it, you must provide prices that correspond to each option. These should </w:t>
+      </w:r>
+      <w:r>
+        <w:t>not</w:t>
+      </w:r>
+      <w:r>
+        <w:t xml:space="preserve"> have a dollar sign in front of them. </w:t>
+      </w:r>
+      <w:r>
+        <w:t>For</w:t>
+      </w:r>
+      <w:r>
+        <w:t xml:space="preserve"> example:</w:t>
+      </w:r>
+    </w:p>
+    <w:p>
+      <w:pPr>
+        <w:rPr>
+          <w:i/>
+          <w:iCs/>
+        </w:rPr>
+      </w:pPr>
+      <w:r>
+        <w:rPr>
+          <w:i/>
+          <w:iCs/>
+        </w:rPr>
+        <w:t>Small Medium Large</w:t>
+      </w:r>
+      <w:r>
+        <w:rPr>
+          <w:i/>
+          <w:iCs/>
+        </w:rPr>
+        <w:br/>
+        <w:t>1.00 2.00 3.00</w:t>
+      </w:r>
+    </w:p>
+    <w:p>
+      <w:r>
+        <w:t>You may add as many options as you would like, as long as you have an equal amount of prices to match them. You are also allowed to add multiple sets of options one after another until the next item on the menu. An example “menu.txt” file is shown below:</w:t>
+      </w:r>
+    </w:p>
+    <w:p>
+      <w:pPr>
+        <w:rPr>
+          <w:i/>
+          <w:iCs/>
+        </w:rPr>
+      </w:pPr>
+      <w:r>
+        <w:rPr>
+          <w:i/>
+          <w:iCs/>
+        </w:rPr>
+        <w:t>-Burger</w:t>
+      </w:r>
+      <w:r>
+        <w:rPr>
+          <w:i/>
+          <w:iCs/>
+        </w:rPr>
+        <w:br/>
+        <w:t>Small Medium Large</w:t>
+      </w:r>
+      <w:r>
+        <w:rPr>
+          <w:i/>
+          <w:iCs/>
+        </w:rPr>
+        <w:br/>
+        <w:t>4.00 6.00 8.00</w:t>
+      </w:r>
+      <w:r>
+        <w:rPr>
+          <w:i/>
+          <w:iCs/>
+        </w:rPr>
+        <w:br/>
+        <w:t>Ketchup Mustard</w:t>
+      </w:r>
+      <w:r>
+        <w:rPr>
+          <w:i/>
+          <w:iCs/>
+        </w:rPr>
+        <w:br/>
+      </w:r>
+      <w:r>
+        <w:rPr>
+          <w:i/>
+          <w:iCs/>
+        </w:rPr>
+        <w:t>0.50 0.50</w:t>
+      </w:r>
+      <w:r>
+        <w:rPr>
+          <w:i/>
+          <w:iCs/>
+        </w:rPr>
+        <w:br/>
+        <w:t>-Fries</w:t>
+      </w:r>
+      <w:r>
+        <w:rPr>
+          <w:i/>
+          <w:iCs/>
+        </w:rPr>
+        <w:br/>
+        <w:t>Small Medium Large</w:t>
+      </w:r>
+      <w:r>
+        <w:rPr>
+          <w:i/>
+          <w:iCs/>
+        </w:rPr>
+        <w:br/>
+        <w:t>1.00 2.00 3.00</w:t>
+      </w:r>
+    </w:p>
+    <w:p/>
+    <w:p/>
+    <w:p/>
+    <w:p/>
+    <w:p/>
+    <w:p/>
+    <w:p>
+      <w:pPr>
+        <w:rPr>
+          <w:b/>
+          <w:bCs/>
+        </w:rPr>
+      </w:pPr>
+      <w:r>
+        <w:rPr>
+          <w:b/>
+          <w:bCs/>
+        </w:rPr>
+        <w:lastRenderedPageBreak/>
+        <w:t>Using the Application</w:t>
+      </w:r>
+    </w:p>
+    <w:p>
+      <w:r>
+        <w:t>Using the Gourmet Gateway Application is very straightforward and simple</w:t>
+      </w:r>
+      <w:r>
+        <w:t xml:space="preserve">. When a user runs the application, </w:t>
+      </w:r>
+      <w:r>
+        <w:t xml:space="preserve">the application will display the menu with numbers that correspond to each item. </w:t>
+      </w:r>
+      <w:r>
+        <w:t xml:space="preserve">To select an item, the user simply </w:t>
+      </w:r>
+      <w:r>
+        <w:t>must</w:t>
+      </w:r>
+      <w:r>
+        <w:t xml:space="preserve"> type the number of the option that they would like to choose and hit “enter” or “return” on their keyboard.</w:t>
+      </w:r>
+    </w:p>
+    <w:p>
+      <w:r>
+        <w:t xml:space="preserve">Once the user has selected all items that they wish to order, they can choose the </w:t>
+      </w:r>
+      <w:r>
+        <w:t>“Complete Order” option to submit the order and quit the application. After doing so, the “orders.txt” file will now contain their submitted order.</w:t>
+      </w:r>
+    </w:p>
+    <w:p/>
+    <w:p/>
+    <w:p/>
+    <w:p/>
+    <w:p/>
+    <w:p/>
+    <w:p/>
+    <w:p/>
+    <w:p/>
+    <w:p/>
+    <w:p/>
+    <w:p/>
+    <w:p/>
+    <w:p/>
+    <w:p/>
+    <w:p/>
+    <w:p/>
+    <w:p/>
+    <w:p/>
+    <w:p>
+      <w:r>
+        <w:rPr>
+          <w:b/>
+          <w:bCs/>
+        </w:rPr>
+        <w:lastRenderedPageBreak/>
+        <w:t>Finding the Orders</w:t>
+      </w:r>
+    </w:p>
+    <w:p>
+      <w:r>
+        <w:t xml:space="preserve">The Gourmet Gateway Application makes it very easy to access an order once it has been submitted. All you need to do is </w:t>
+      </w:r>
+      <w:r>
+        <w:t>access the “orders.txt” file, and you can see the current order in the system.</w:t>
+      </w:r>
+      <w:r>
+        <w:t xml:space="preserve"> </w:t>
+      </w:r>
+    </w:p>
     <w:sectPr>
-      <w:pgSz w:w="12240" w:h="15840" w:orient="portrait"/>
+      <w:headerReference w:type="default" r:id="rId7"/>
+      <w:footerReference w:type="default" r:id="rId8"/>
+      <w:pgSz w:w="12240" w:h="15840"/>
       <w:pgMar w:top="1440" w:right="1440" w:bottom="1440" w:left="1440" w:header="720" w:footer="720" w:gutter="0"/>
       <w:cols w:space="720"/>
       <w:docGrid w:linePitch="360"/>
@@ -91,12 +478,258 @@
 </w:document>
 </file>
 
+<file path=word/endnotes.xml><?xml version="1.0" encoding="utf-8"?>
+<w:endnotes xmlns:wpc="http://schemas.microsoft.com/office/word/2010/wordprocessingCanvas" xmlns:cx="http://schemas.microsoft.com/office/drawing/2014/chartex" xmlns:cx1="http://schemas.microsoft.com/office/drawing/2015/9/8/chartex" xmlns:cx2="http://schemas.microsoft.com/office/drawing/2015/10/21/chartex" xmlns:cx3="http://schemas.microsoft.com/office/drawing/2016/5/9/chartex" xmlns:cx4="http://schemas.microsoft.com/office/drawing/2016/5/10/chartex" xmlns:cx5="http://schemas.microsoft.com/office/drawing/2016/5/11/chartex" xmlns:cx6="http://schemas.microsoft.com/office/drawing/2016/5/12/chartex" xmlns:cx7="http://schemas.microsoft.com/office/drawing/2016/5/13/chartex" xmlns:cx8="http://schemas.microsoft.com/office/drawing/2016/5/14/chartex" xmlns:mc="http://schemas.openxmlformats.org/markup-compatibility/2006" xmlns:aink="http://schemas.microsoft.com/office/drawing/2016/ink" xmlns:am3d="http://schemas.microsoft.com/office/drawing/2017/model3d" xmlns:o="urn:schemas-microsoft-com:office:office" xmlns:oel="http://schemas.microsoft.com/office/2019/extlst" xmlns:r="http://schemas.openxmlformats.org/officeDocument/2006/relationships" xmlns:m="http://schemas.openxmlformats.org/officeDocument/2006/math" xmlns:v="urn:schemas-microsoft-com:vml" xmlns:wp14="http://schemas.microsoft.com/office/word/2010/wordprocessingDrawing" xmlns:wp="http://schemas.openxmlformats.org/drawingml/2006/wordprocessingDrawing" xmlns:w10="urn:schemas-microsoft-com:office:word" xmlns:w="http://schemas.openxmlformats.org/wordprocessingml/2006/main" xmlns:w14="http://schemas.microsoft.com/office/word/2010/wordml" xmlns:w15="http://schemas.microsoft.com/office/word/2012/wordml" xmlns:w16cex="http://schemas.microsoft.com/office/word/2018/wordml/cex" xmlns:w16cid="http://schemas.microsoft.com/office/word/2016/wordml/cid" xmlns:w16="http://schemas.microsoft.com/office/word/2018/wordml" xmlns:w16du="http://schemas.microsoft.com/office/word/2023/wordml/word16du" xmlns:w16sdtdh="http://schemas.microsoft.com/office/word/2020/wordml/sdtdatahash" xmlns:w16sdtfl="http://schemas.microsoft.com/office/word/2024/wordml/sdtformatlock" xmlns:w16se="http://schemas.microsoft.com/office/word/2015/wordml/symex" xmlns:wpg="http://schemas.microsoft.com/office/word/2010/wordprocessingGroup" xmlns:wpi="http://schemas.microsoft.com/office/word/2010/wordprocessingInk" xmlns:wne="http://schemas.microsoft.com/office/word/2006/wordml" xmlns:wps="http://schemas.microsoft.com/office/word/2010/wordprocessingShape" mc:Ignorable="w14 w15 w16se w16cid w16 w16cex w16sdtdh w16sdtfl w16du wp14">
+  <w:endnote w:type="separator" w:id="-1">
+    <w:p>
+      <w:pPr>
+        <w:spacing w:after="0" w:line="240" w:lineRule="auto"/>
+      </w:pPr>
+      <w:r>
+        <w:separator/>
+      </w:r>
+    </w:p>
+  </w:endnote>
+  <w:endnote w:type="continuationSeparator" w:id="0">
+    <w:p>
+      <w:pPr>
+        <w:spacing w:after="0" w:line="240" w:lineRule="auto"/>
+      </w:pPr>
+      <w:r>
+        <w:continuationSeparator/>
+      </w:r>
+    </w:p>
+  </w:endnote>
+</w:endnotes>
+</file>
+
+<file path=word/footer1.xml><?xml version="1.0" encoding="utf-8"?>
+<w:ftr xmlns:wpc="http://schemas.microsoft.com/office/word/2010/wordprocessingCanvas" xmlns:cx="http://schemas.microsoft.com/office/drawing/2014/chartex" xmlns:cx1="http://schemas.microsoft.com/office/drawing/2015/9/8/chartex" xmlns:cx2="http://schemas.microsoft.com/office/drawing/2015/10/21/chartex" xmlns:cx3="http://schemas.microsoft.com/office/drawing/2016/5/9/chartex" xmlns:cx4="http://schemas.microsoft.com/office/drawing/2016/5/10/chartex" xmlns:cx5="http://schemas.microsoft.com/office/drawing/2016/5/11/chartex" xmlns:cx6="http://schemas.microsoft.com/office/drawing/2016/5/12/chartex" xmlns:cx7="http://schemas.microsoft.com/office/drawing/2016/5/13/chartex" xmlns:cx8="http://schemas.microsoft.com/office/drawing/2016/5/14/chartex" xmlns:mc="http://schemas.openxmlformats.org/markup-compatibility/2006" xmlns:aink="http://schemas.microsoft.com/office/drawing/2016/ink" xmlns:am3d="http://schemas.microsoft.com/office/drawing/2017/model3d" xmlns:o="urn:schemas-microsoft-com:office:office" xmlns:oel="http://schemas.microsoft.com/office/2019/extlst" xmlns:r="http://schemas.openxmlformats.org/officeDocument/2006/relationships" xmlns:m="http://schemas.openxmlformats.org/officeDocument/2006/math" xmlns:v="urn:schemas-microsoft-com:vml" xmlns:wp14="http://schemas.microsoft.com/office/word/2010/wordprocessingDrawing" xmlns:wp="http://schemas.openxmlformats.org/drawingml/2006/wordprocessingDrawing" xmlns:w10="urn:schemas-microsoft-com:office:word" xmlns:w="http://schemas.openxmlformats.org/wordprocessingml/2006/main" xmlns:w14="http://schemas.microsoft.com/office/word/2010/wordml" xmlns:w15="http://schemas.microsoft.com/office/word/2012/wordml" xmlns:w16cex="http://schemas.microsoft.com/office/word/2018/wordml/cex" xmlns:w16cid="http://schemas.microsoft.com/office/word/2016/wordml/cid" xmlns:w16="http://schemas.microsoft.com/office/word/2018/wordml" xmlns:w16du="http://schemas.microsoft.com/office/word/2023/wordml/word16du" xmlns:w16sdtdh="http://schemas.microsoft.com/office/word/2020/wordml/sdtdatahash" xmlns:w16sdtfl="http://schemas.microsoft.com/office/word/2024/wordml/sdtformatlock" xmlns:w16se="http://schemas.microsoft.com/office/word/2015/wordml/symex" xmlns:wpg="http://schemas.microsoft.com/office/word/2010/wordprocessingGroup" xmlns:wpi="http://schemas.microsoft.com/office/word/2010/wordprocessingInk" xmlns:wne="http://schemas.microsoft.com/office/word/2006/wordml" xmlns:wps="http://schemas.microsoft.com/office/word/2010/wordprocessingShape" mc:Ignorable="w14 w15 w16se w16cid w16 w16cex w16sdtdh w16sdtfl w16du wp14">
+  <w:p>
+    <w:pPr>
+      <w:pStyle w:val="Footer"/>
+      <w:tabs>
+        <w:tab w:val="clear" w:pos="4680"/>
+        <w:tab w:val="clear" w:pos="9360"/>
+      </w:tabs>
+      <w:jc w:val="center"/>
+      <w:rPr>
+        <w:caps/>
+        <w:noProof/>
+        <w:color w:val="156082" w:themeColor="accent1"/>
+      </w:rPr>
+    </w:pPr>
+    <w:r>
+      <w:rPr>
+        <w:caps/>
+        <w:color w:val="156082" w:themeColor="accent1"/>
+      </w:rPr>
+      <w:fldChar w:fldCharType="begin"/>
+    </w:r>
+    <w:r>
+      <w:rPr>
+        <w:caps/>
+        <w:color w:val="156082" w:themeColor="accent1"/>
+      </w:rPr>
+      <w:instrText xml:space="preserve"> PAGE   \* MERGEFORMAT </w:instrText>
+    </w:r>
+    <w:r>
+      <w:rPr>
+        <w:caps/>
+        <w:color w:val="156082" w:themeColor="accent1"/>
+      </w:rPr>
+      <w:fldChar w:fldCharType="separate"/>
+    </w:r>
+    <w:r>
+      <w:rPr>
+        <w:caps/>
+        <w:noProof/>
+        <w:color w:val="156082" w:themeColor="accent1"/>
+      </w:rPr>
+      <w:t>2</w:t>
+    </w:r>
+    <w:r>
+      <w:rPr>
+        <w:caps/>
+        <w:noProof/>
+        <w:color w:val="156082" w:themeColor="accent1"/>
+      </w:rPr>
+      <w:fldChar w:fldCharType="end"/>
+    </w:r>
+  </w:p>
+  <w:p>
+    <w:pPr>
+      <w:pStyle w:val="Footer"/>
+    </w:pPr>
+  </w:p>
+</w:ftr>
+</file>
+
+<file path=word/footnotes.xml><?xml version="1.0" encoding="utf-8"?>
+<w:footnotes xmlns:wpc="http://schemas.microsoft.com/office/word/2010/wordprocessingCanvas" xmlns:cx="http://schemas.microsoft.com/office/drawing/2014/chartex" xmlns:cx1="http://schemas.microsoft.com/office/drawing/2015/9/8/chartex" xmlns:cx2="http://schemas.microsoft.com/office/drawing/2015/10/21/chartex" xmlns:cx3="http://schemas.microsoft.com/office/drawing/2016/5/9/chartex" xmlns:cx4="http://schemas.microsoft.com/office/drawing/2016/5/10/chartex" xmlns:cx5="http://schemas.microsoft.com/office/drawing/2016/5/11/chartex" xmlns:cx6="http://schemas.microsoft.com/office/drawing/2016/5/12/chartex" xmlns:cx7="http://schemas.microsoft.com/office/drawing/2016/5/13/chartex" xmlns:cx8="http://schemas.microsoft.com/office/drawing/2016/5/14/chartex" xmlns:mc="http://schemas.openxmlformats.org/markup-compatibility/2006" xmlns:aink="http://schemas.microsoft.com/office/drawing/2016/ink" xmlns:am3d="http://schemas.microsoft.com/office/drawing/2017/model3d" xmlns:o="urn:schemas-microsoft-com:office:office" xmlns:oel="http://schemas.microsoft.com/office/2019/extlst" xmlns:r="http://schemas.openxmlformats.org/officeDocument/2006/relationships" xmlns:m="http://schemas.openxmlformats.org/officeDocument/2006/math" xmlns:v="urn:schemas-microsoft-com:vml" xmlns:wp14="http://schemas.microsoft.com/office/word/2010/wordprocessingDrawing" xmlns:wp="http://schemas.openxmlformats.org/drawingml/2006/wordprocessingDrawing" xmlns:w10="urn:schemas-microsoft-com:office:word" xmlns:w="http://schemas.openxmlformats.org/wordprocessingml/2006/main" xmlns:w14="http://schemas.microsoft.com/office/word/2010/wordml" xmlns:w15="http://schemas.microsoft.com/office/word/2012/wordml" xmlns:w16cex="http://schemas.microsoft.com/office/word/2018/wordml/cex" xmlns:w16cid="http://schemas.microsoft.com/office/word/2016/wordml/cid" xmlns:w16="http://schemas.microsoft.com/office/word/2018/wordml" xmlns:w16du="http://schemas.microsoft.com/office/word/2023/wordml/word16du" xmlns:w16sdtdh="http://schemas.microsoft.com/office/word/2020/wordml/sdtdatahash" xmlns:w16sdtfl="http://schemas.microsoft.com/office/word/2024/wordml/sdtformatlock" xmlns:w16se="http://schemas.microsoft.com/office/word/2015/wordml/symex" xmlns:wpg="http://schemas.microsoft.com/office/word/2010/wordprocessingGroup" xmlns:wpi="http://schemas.microsoft.com/office/word/2010/wordprocessingInk" xmlns:wne="http://schemas.microsoft.com/office/word/2006/wordml" xmlns:wps="http://schemas.microsoft.com/office/word/2010/wordprocessingShape" mc:Ignorable="w14 w15 w16se w16cid w16 w16cex w16sdtdh w16sdtfl w16du wp14">
+  <w:footnote w:type="separator" w:id="-1">
+    <w:p>
+      <w:pPr>
+        <w:spacing w:after="0" w:line="240" w:lineRule="auto"/>
+      </w:pPr>
+      <w:r>
+        <w:separator/>
+      </w:r>
+    </w:p>
+  </w:footnote>
+  <w:footnote w:type="continuationSeparator" w:id="0">
+    <w:p>
+      <w:pPr>
+        <w:spacing w:after="0" w:line="240" w:lineRule="auto"/>
+      </w:pPr>
+      <w:r>
+        <w:continuationSeparator/>
+      </w:r>
+    </w:p>
+  </w:footnote>
+</w:footnotes>
+</file>
+
+<file path=word/header1.xml><?xml version="1.0" encoding="utf-8"?>
+<w:hdr xmlns:wpc="http://schemas.microsoft.com/office/word/2010/wordprocessingCanvas" xmlns:cx="http://schemas.microsoft.com/office/drawing/2014/chartex" xmlns:cx1="http://schemas.microsoft.com/office/drawing/2015/9/8/chartex" xmlns:cx2="http://schemas.microsoft.com/office/drawing/2015/10/21/chartex" xmlns:cx3="http://schemas.microsoft.com/office/drawing/2016/5/9/chartex" xmlns:cx4="http://schemas.microsoft.com/office/drawing/2016/5/10/chartex" xmlns:cx5="http://schemas.microsoft.com/office/drawing/2016/5/11/chartex" xmlns:cx6="http://schemas.microsoft.com/office/drawing/2016/5/12/chartex" xmlns:cx7="http://schemas.microsoft.com/office/drawing/2016/5/13/chartex" xmlns:cx8="http://schemas.microsoft.com/office/drawing/2016/5/14/chartex" xmlns:mc="http://schemas.openxmlformats.org/markup-compatibility/2006" xmlns:aink="http://schemas.microsoft.com/office/drawing/2016/ink" xmlns:am3d="http://schemas.microsoft.com/office/drawing/2017/model3d" xmlns:o="urn:schemas-microsoft-com:office:office" xmlns:oel="http://schemas.microsoft.com/office/2019/extlst" xmlns:r="http://schemas.openxmlformats.org/officeDocument/2006/relationships" xmlns:m="http://schemas.openxmlformats.org/officeDocument/2006/math" xmlns:v="urn:schemas-microsoft-com:vml" xmlns:wp14="http://schemas.microsoft.com/office/word/2010/wordprocessingDrawing" xmlns:wp="http://schemas.openxmlformats.org/drawingml/2006/wordprocessingDrawing" xmlns:w10="urn:schemas-microsoft-com:office:word" xmlns:w="http://schemas.openxmlformats.org/wordprocessingml/2006/main" xmlns:w14="http://schemas.microsoft.com/office/word/2010/wordml" xmlns:w15="http://schemas.microsoft.com/office/word/2012/wordml" xmlns:w16cex="http://schemas.microsoft.com/office/word/2018/wordml/cex" xmlns:w16cid="http://schemas.microsoft.com/office/word/2016/wordml/cid" xmlns:w16="http://schemas.microsoft.com/office/word/2018/wordml" xmlns:w16du="http://schemas.microsoft.com/office/word/2023/wordml/word16du" xmlns:w16sdtdh="http://schemas.microsoft.com/office/word/2020/wordml/sdtdatahash" xmlns:w16sdtfl="http://schemas.microsoft.com/office/word/2024/wordml/sdtformatlock" xmlns:w16se="http://schemas.microsoft.com/office/word/2015/wordml/symex" xmlns:wpg="http://schemas.microsoft.com/office/word/2010/wordprocessingGroup" xmlns:wpi="http://schemas.microsoft.com/office/word/2010/wordprocessingInk" xmlns:wne="http://schemas.microsoft.com/office/word/2006/wordml" xmlns:wps="http://schemas.microsoft.com/office/word/2010/wordprocessingShape" mc:Ignorable="w14 w15 w16se w16cid w16 w16cex w16sdtdh w16sdtfl w16du wp14">
+  <w:p>
+    <w:pPr>
+      <w:pStyle w:val="Header"/>
+    </w:pPr>
+    <w:r>
+      <w:t>Gourmet Gateway User Documentation</w:t>
+    </w:r>
+  </w:p>
+</w:hdr>
+</file>
+
+<file path=word/numbering.xml><?xml version="1.0" encoding="utf-8"?>
+<w:numbering xmlns:wpc="http://schemas.microsoft.com/office/word/2010/wordprocessingCanvas" xmlns:cx="http://schemas.microsoft.com/office/drawing/2014/chartex" xmlns:cx1="http://schemas.microsoft.com/office/drawing/2015/9/8/chartex" xmlns:cx2="http://schemas.microsoft.com/office/drawing/2015/10/21/chartex" xmlns:cx3="http://schemas.microsoft.com/office/drawing/2016/5/9/chartex" xmlns:cx4="http://schemas.microsoft.com/office/drawing/2016/5/10/chartex" xmlns:cx5="http://schemas.microsoft.com/office/drawing/2016/5/11/chartex" xmlns:cx6="http://schemas.microsoft.com/office/drawing/2016/5/12/chartex" xmlns:cx7="http://schemas.microsoft.com/office/drawing/2016/5/13/chartex" xmlns:cx8="http://schemas.microsoft.com/office/drawing/2016/5/14/chartex" xmlns:mc="http://schemas.openxmlformats.org/markup-compatibility/2006" xmlns:aink="http://schemas.microsoft.com/office/drawing/2016/ink" xmlns:am3d="http://schemas.microsoft.com/office/drawing/2017/model3d" xmlns:o="urn:schemas-microsoft-com:office:office" xmlns:oel="http://schemas.microsoft.com/office/2019/extlst" xmlns:r="http://schemas.openxmlformats.org/officeDocument/2006/relationships" xmlns:m="http://schemas.openxmlformats.org/officeDocument/2006/math" xmlns:v="urn:schemas-microsoft-com:vml" xmlns:wp14="http://schemas.microsoft.com/office/word/2010/wordprocessingDrawing" xmlns:wp="http://schemas.openxmlformats.org/drawingml/2006/wordprocessingDrawing" xmlns:w10="urn:schemas-microsoft-com:office:word" xmlns:w="http://schemas.openxmlformats.org/wordprocessingml/2006/main" xmlns:w14="http://schemas.microsoft.com/office/word/2010/wordml" xmlns:w15="http://schemas.microsoft.com/office/word/2012/wordml" xmlns:w16cex="http://schemas.microsoft.com/office/word/2018/wordml/cex" xmlns:w16cid="http://schemas.microsoft.com/office/word/2016/wordml/cid" xmlns:w16="http://schemas.microsoft.com/office/word/2018/wordml" xmlns:w16du="http://schemas.microsoft.com/office/word/2023/wordml/word16du" xmlns:w16sdtdh="http://schemas.microsoft.com/office/word/2020/wordml/sdtdatahash" xmlns:w16sdtfl="http://schemas.microsoft.com/office/word/2024/wordml/sdtformatlock" xmlns:w16se="http://schemas.microsoft.com/office/word/2015/wordml/symex" xmlns:wpg="http://schemas.microsoft.com/office/word/2010/wordprocessingGroup" xmlns:wpi="http://schemas.microsoft.com/office/word/2010/wordprocessingInk" xmlns:wne="http://schemas.microsoft.com/office/word/2006/wordml" xmlns:wps="http://schemas.microsoft.com/office/word/2010/wordprocessingShape" mc:Ignorable="w14 w15 w16se w16cid w16 w16cex w16sdtdh w16sdtfl w16du wp14">
+  <w:abstractNum w:abstractNumId="0" w15:restartNumberingAfterBreak="0">
+    <w:nsid w:val="780B1BCE"/>
+    <w:multiLevelType w:val="hybridMultilevel"/>
+    <w:tmpl w:val="DC845720"/>
+    <w:lvl w:ilvl="0" w:tplc="04090001">
+      <w:start w:val="1"/>
+      <w:numFmt w:val="bullet"/>
+      <w:lvlText w:val=""/>
+      <w:lvlJc w:val="left"/>
+      <w:pPr>
+        <w:ind w:left="720" w:hanging="360"/>
+      </w:pPr>
+      <w:rPr>
+        <w:rFonts w:ascii="Symbol" w:hAnsi="Symbol" w:hint="default"/>
+      </w:rPr>
+    </w:lvl>
+    <w:lvl w:ilvl="1" w:tplc="04090003" w:tentative="1">
+      <w:start w:val="1"/>
+      <w:numFmt w:val="bullet"/>
+      <w:lvlText w:val="o"/>
+      <w:lvlJc w:val="left"/>
+      <w:pPr>
+        <w:ind w:left="1440" w:hanging="360"/>
+      </w:pPr>
+      <w:rPr>
+        <w:rFonts w:ascii="Courier New" w:hAnsi="Courier New" w:cs="Courier New" w:hint="default"/>
+      </w:rPr>
+    </w:lvl>
+    <w:lvl w:ilvl="2" w:tplc="04090005" w:tentative="1">
+      <w:start w:val="1"/>
+      <w:numFmt w:val="bullet"/>
+      <w:lvlText w:val=""/>
+      <w:lvlJc w:val="left"/>
+      <w:pPr>
+        <w:ind w:left="2160" w:hanging="360"/>
+      </w:pPr>
+      <w:rPr>
+        <w:rFonts w:ascii="Wingdings" w:hAnsi="Wingdings" w:hint="default"/>
+      </w:rPr>
+    </w:lvl>
+    <w:lvl w:ilvl="3" w:tplc="04090001" w:tentative="1">
+      <w:start w:val="1"/>
+      <w:numFmt w:val="bullet"/>
+      <w:lvlText w:val=""/>
+      <w:lvlJc w:val="left"/>
+      <w:pPr>
+        <w:ind w:left="2880" w:hanging="360"/>
+      </w:pPr>
+      <w:rPr>
+        <w:rFonts w:ascii="Symbol" w:hAnsi="Symbol" w:hint="default"/>
+      </w:rPr>
+    </w:lvl>
+    <w:lvl w:ilvl="4" w:tplc="04090003" w:tentative="1">
+      <w:start w:val="1"/>
+      <w:numFmt w:val="bullet"/>
+      <w:lvlText w:val="o"/>
+      <w:lvlJc w:val="left"/>
+      <w:pPr>
+        <w:ind w:left="3600" w:hanging="360"/>
+      </w:pPr>
+      <w:rPr>
+        <w:rFonts w:ascii="Courier New" w:hAnsi="Courier New" w:cs="Courier New" w:hint="default"/>
+      </w:rPr>
+    </w:lvl>
+    <w:lvl w:ilvl="5" w:tplc="04090005" w:tentative="1">
+      <w:start w:val="1"/>
+      <w:numFmt w:val="bullet"/>
+      <w:lvlText w:val=""/>
+      <w:lvlJc w:val="left"/>
+      <w:pPr>
+        <w:ind w:left="4320" w:hanging="360"/>
+      </w:pPr>
+      <w:rPr>
+        <w:rFonts w:ascii="Wingdings" w:hAnsi="Wingdings" w:hint="default"/>
+      </w:rPr>
+    </w:lvl>
+    <w:lvl w:ilvl="6" w:tplc="04090001" w:tentative="1">
+      <w:start w:val="1"/>
+      <w:numFmt w:val="bullet"/>
+      <w:lvlText w:val=""/>
+      <w:lvlJc w:val="left"/>
+      <w:pPr>
+        <w:ind w:left="5040" w:hanging="360"/>
+      </w:pPr>
+      <w:rPr>
+        <w:rFonts w:ascii="Symbol" w:hAnsi="Symbol" w:hint="default"/>
+      </w:rPr>
+    </w:lvl>
+    <w:lvl w:ilvl="7" w:tplc="04090003" w:tentative="1">
+      <w:start w:val="1"/>
+      <w:numFmt w:val="bullet"/>
+      <w:lvlText w:val="o"/>
+      <w:lvlJc w:val="left"/>
+      <w:pPr>
+        <w:ind w:left="5760" w:hanging="360"/>
+      </w:pPr>
+      <w:rPr>
+        <w:rFonts w:ascii="Courier New" w:hAnsi="Courier New" w:cs="Courier New" w:hint="default"/>
+      </w:rPr>
+    </w:lvl>
+    <w:lvl w:ilvl="8" w:tplc="04090005" w:tentative="1">
+      <w:start w:val="1"/>
+      <w:numFmt w:val="bullet"/>
+      <w:lvlText w:val=""/>
+      <w:lvlJc w:val="left"/>
+      <w:pPr>
+        <w:ind w:left="6480" w:hanging="360"/>
+      </w:pPr>
+      <w:rPr>
+        <w:rFonts w:ascii="Wingdings" w:hAnsi="Wingdings" w:hint="default"/>
+      </w:rPr>
+    </w:lvl>
+  </w:abstractNum>
+  <w:num w:numId="1" w16cid:durableId="872572780">
+    <w:abstractNumId w:val="0"/>
+  </w:num>
+</w:numbering>
+</file>
+
 <file path=word/styles.xml><?xml version="1.0" encoding="utf-8"?>
-<w:styles xmlns:wp14="http://schemas.microsoft.com/office/word/2010/wordprocessingDrawing" xmlns:mc="http://schemas.openxmlformats.org/markup-compatibility/2006" xmlns:r="http://schemas.openxmlformats.org/officeDocument/2006/relationships" xmlns:w="http://schemas.openxmlformats.org/wordprocessingml/2006/main" xmlns:w14="http://schemas.microsoft.com/office/word/2010/wordml" xmlns:w15="http://schemas.microsoft.com/office/word/2012/wordml" xmlns:w16se="http://schemas.microsoft.com/office/word/2015/wordml/symex" xmlns:w16cid="http://schemas.microsoft.com/office/word/2016/wordml/cid" xmlns:w16="http://schemas.microsoft.com/office/word/2018/wordml" xmlns:w16cex="http://schemas.microsoft.com/office/word/2018/wordml/cex" xmlns:w16sdtdh="http://schemas.microsoft.com/office/word/2020/wordml/sdtdatahash" xmlns:w16sdtfl="http://schemas.microsoft.com/office/word/2024/wordml/sdtformatlock" mc:Ignorable="w14 w15 wp14 w16se w16cid w16 w16cex w16sdtdh w16sdtfl">
+<w:styles xmlns:mc="http://schemas.openxmlformats.org/markup-compatibility/2006" xmlns:r="http://schemas.openxmlformats.org/officeDocument/2006/relationships" xmlns:w="http://schemas.openxmlformats.org/wordprocessingml/2006/main" xmlns:w14="http://schemas.microsoft.com/office/word/2010/wordml" xmlns:w15="http://schemas.microsoft.com/office/word/2012/wordml" xmlns:w16cex="http://schemas.microsoft.com/office/word/2018/wordml/cex" xmlns:w16cid="http://schemas.microsoft.com/office/word/2016/wordml/cid" xmlns:w16="http://schemas.microsoft.com/office/word/2018/wordml" xmlns:w16du="http://schemas.microsoft.com/office/word/2023/wordml/word16du" xmlns:w16sdtdh="http://schemas.microsoft.com/office/word/2020/wordml/sdtdatahash" xmlns:w16sdtfl="http://schemas.microsoft.com/office/word/2024/wordml/sdtformatlock" xmlns:w16se="http://schemas.microsoft.com/office/word/2015/wordml/symex" mc:Ignorable="w14 w15 w16se w16cid w16 w16cex w16sdtdh w16sdtfl w16du">
   <w:docDefaults>
     <w:rPrDefault>
       <w:rPr>
-        <w:rFonts w:asciiTheme="minorHAnsi" w:hAnsiTheme="minorHAnsi" w:eastAsiaTheme="minorEastAsia" w:cstheme="minorBidi"/>
+        <w:rFonts w:asciiTheme="minorHAnsi" w:eastAsiaTheme="minorEastAsia" w:hAnsiTheme="minorHAnsi" w:cstheme="minorBidi"/>
         <w:sz w:val="24"/>
         <w:szCs w:val="24"/>
         <w:lang w:val="en-US" w:eastAsia="ja-JP" w:bidi="ar-SA"/>
@@ -108,17 +741,17 @@
       </w:pPr>
     </w:pPrDefault>
   </w:docDefaults>
-  <w:latentStyles w:defLockedState="0" w:defUIPriority="99" w:defSemiHidden="0" w:defUnhideWhenUsed="0" w:defQFormat="0" w:count="371">
+  <w:latentStyles w:defLockedState="0" w:defUIPriority="99" w:defSemiHidden="0" w:defUnhideWhenUsed="0" w:defQFormat="0" w:count="376">
     <w:lsdException w:name="Normal" w:uiPriority="0" w:qFormat="1"/>
     <w:lsdException w:name="heading 1" w:uiPriority="9" w:qFormat="1"/>
-    <w:lsdException w:name="heading 2" w:uiPriority="9" w:semiHidden="1" w:unhideWhenUsed="1" w:qFormat="1"/>
-    <w:lsdException w:name="heading 3" w:uiPriority="9" w:semiHidden="1" w:unhideWhenUsed="1" w:qFormat="1"/>
-    <w:lsdException w:name="heading 4" w:uiPriority="9" w:semiHidden="1" w:unhideWhenUsed="1" w:qFormat="1"/>
-    <w:lsdException w:name="heading 5" w:uiPriority="9" w:semiHidden="1" w:unhideWhenUsed="1" w:qFormat="1"/>
-    <w:lsdException w:name="heading 6" w:uiPriority="9" w:semiHidden="1" w:unhideWhenUsed="1" w:qFormat="1"/>
-    <w:lsdException w:name="heading 7" w:uiPriority="9" w:semiHidden="1" w:unhideWhenUsed="1" w:qFormat="1"/>
-    <w:lsdException w:name="heading 8" w:uiPriority="9" w:semiHidden="1" w:unhideWhenUsed="1" w:qFormat="1"/>
-    <w:lsdException w:name="heading 9" w:uiPriority="9" w:semiHidden="1" w:unhideWhenUsed="1" w:qFormat="1"/>
+    <w:lsdException w:name="heading 2" w:semiHidden="1" w:uiPriority="9" w:unhideWhenUsed="1" w:qFormat="1"/>
+    <w:lsdException w:name="heading 3" w:semiHidden="1" w:uiPriority="9" w:unhideWhenUsed="1" w:qFormat="1"/>
+    <w:lsdException w:name="heading 4" w:semiHidden="1" w:uiPriority="9" w:unhideWhenUsed="1" w:qFormat="1"/>
+    <w:lsdException w:name="heading 5" w:semiHidden="1" w:uiPriority="9" w:unhideWhenUsed="1" w:qFormat="1"/>
+    <w:lsdException w:name="heading 6" w:semiHidden="1" w:uiPriority="9" w:unhideWhenUsed="1" w:qFormat="1"/>
+    <w:lsdException w:name="heading 7" w:semiHidden="1" w:uiPriority="9" w:unhideWhenUsed="1" w:qFormat="1"/>
+    <w:lsdException w:name="heading 8" w:semiHidden="1" w:uiPriority="9" w:unhideWhenUsed="1" w:qFormat="1"/>
+    <w:lsdException w:name="heading 9" w:semiHidden="1" w:uiPriority="9" w:unhideWhenUsed="1" w:qFormat="1"/>
     <w:lsdException w:name="index 1" w:semiHidden="1" w:unhideWhenUsed="1"/>
     <w:lsdException w:name="index 2" w:semiHidden="1" w:unhideWhenUsed="1"/>
     <w:lsdException w:name="index 3" w:semiHidden="1" w:unhideWhenUsed="1"/>
@@ -128,22 +761,22 @@
     <w:lsdException w:name="index 7" w:semiHidden="1" w:unhideWhenUsed="1"/>
     <w:lsdException w:name="index 8" w:semiHidden="1" w:unhideWhenUsed="1"/>
     <w:lsdException w:name="index 9" w:semiHidden="1" w:unhideWhenUsed="1"/>
-    <w:lsdException w:name="toc 1" w:uiPriority="39" w:semiHidden="1" w:unhideWhenUsed="1"/>
-    <w:lsdException w:name="toc 2" w:uiPriority="39" w:semiHidden="1" w:unhideWhenUsed="1"/>
-    <w:lsdException w:name="toc 3" w:uiPriority="39" w:semiHidden="1" w:unhideWhenUsed="1"/>
-    <w:lsdException w:name="toc 4" w:uiPriority="39" w:semiHidden="1" w:unhideWhenUsed="1"/>
-    <w:lsdException w:name="toc 5" w:uiPriority="39" w:semiHidden="1" w:unhideWhenUsed="1"/>
-    <w:lsdException w:name="toc 6" w:uiPriority="39" w:semiHidden="1" w:unhideWhenUsed="1"/>
-    <w:lsdException w:name="toc 7" w:uiPriority="39" w:semiHidden="1" w:unhideWhenUsed="1"/>
-    <w:lsdException w:name="toc 8" w:uiPriority="39" w:semiHidden="1" w:unhideWhenUsed="1"/>
-    <w:lsdException w:name="toc 9" w:uiPriority="39" w:semiHidden="1" w:unhideWhenUsed="1"/>
+    <w:lsdException w:name="toc 1" w:semiHidden="1" w:uiPriority="39" w:unhideWhenUsed="1"/>
+    <w:lsdException w:name="toc 2" w:semiHidden="1" w:uiPriority="39" w:unhideWhenUsed="1"/>
+    <w:lsdException w:name="toc 3" w:semiHidden="1" w:uiPriority="39" w:unhideWhenUsed="1"/>
+    <w:lsdException w:name="toc 4" w:semiHidden="1" w:uiPriority="39" w:unhideWhenUsed="1"/>
+    <w:lsdException w:name="toc 5" w:semiHidden="1" w:uiPriority="39" w:unhideWhenUsed="1"/>
+    <w:lsdException w:name="toc 6" w:semiHidden="1" w:uiPriority="39" w:unhideWhenUsed="1"/>
+    <w:lsdException w:name="toc 7" w:semiHidden="1" w:uiPriority="39" w:unhideWhenUsed="1"/>
+    <w:lsdException w:name="toc 8" w:semiHidden="1" w:uiPriority="39" w:unhideWhenUsed="1"/>
+    <w:lsdException w:name="toc 9" w:semiHidden="1" w:uiPriority="39" w:unhideWhenUsed="1"/>
     <w:lsdException w:name="Normal Indent" w:semiHidden="1" w:unhideWhenUsed="1"/>
     <w:lsdException w:name="footnote text" w:semiHidden="1" w:unhideWhenUsed="1"/>
     <w:lsdException w:name="annotation text" w:semiHidden="1" w:unhideWhenUsed="1"/>
     <w:lsdException w:name="header" w:semiHidden="1" w:unhideWhenUsed="1"/>
     <w:lsdException w:name="footer" w:semiHidden="1" w:unhideWhenUsed="1"/>
     <w:lsdException w:name="index heading" w:semiHidden="1" w:unhideWhenUsed="1"/>
-    <w:lsdException w:name="caption" w:uiPriority="35" w:semiHidden="1" w:unhideWhenUsed="1" w:qFormat="1"/>
+    <w:lsdException w:name="caption" w:semiHidden="1" w:uiPriority="35" w:unhideWhenUsed="1" w:qFormat="1"/>
     <w:lsdException w:name="table of figures" w:semiHidden="1" w:unhideWhenUsed="1"/>
     <w:lsdException w:name="envelope address" w:semiHidden="1" w:unhideWhenUsed="1"/>
     <w:lsdException w:name="envelope return" w:semiHidden="1" w:unhideWhenUsed="1"/>
@@ -174,7 +807,7 @@
     <w:lsdException w:name="Title" w:uiPriority="10" w:qFormat="1"/>
     <w:lsdException w:name="Closing" w:semiHidden="1" w:unhideWhenUsed="1"/>
     <w:lsdException w:name="Signature" w:semiHidden="1" w:unhideWhenUsed="1"/>
-    <w:lsdException w:name="Default Paragraph Font" w:uiPriority="1" w:semiHidden="1" w:unhideWhenUsed="1"/>
+    <w:lsdException w:name="Default Paragraph Font" w:semiHidden="1" w:uiPriority="1" w:unhideWhenUsed="1"/>
     <w:lsdException w:name="Body Text" w:semiHidden="1" w:unhideWhenUsed="1"/>
     <w:lsdException w:name="Body Text Indent" w:semiHidden="1" w:unhideWhenUsed="1"/>
     <w:lsdException w:name="List Continue" w:semiHidden="1" w:unhideWhenUsed="1"/>
@@ -374,8 +1007,8 @@
     <w:lsdException w:name="Subtle Reference" w:uiPriority="31" w:qFormat="1"/>
     <w:lsdException w:name="Intense Reference" w:uiPriority="32" w:qFormat="1"/>
     <w:lsdException w:name="Book Title" w:uiPriority="33" w:qFormat="1"/>
-    <w:lsdException w:name="Bibliography" w:uiPriority="37" w:semiHidden="1" w:unhideWhenUsed="1"/>
-    <w:lsdException w:name="TOC Heading" w:uiPriority="39" w:semiHidden="1" w:unhideWhenUsed="1" w:qFormat="1"/>
+    <w:lsdException w:name="Bibliography" w:semiHidden="1" w:uiPriority="37" w:unhideWhenUsed="1"/>
+    <w:lsdException w:name="TOC Heading" w:semiHidden="1" w:uiPriority="39" w:unhideWhenUsed="1" w:qFormat="1"/>
     <w:lsdException w:name="Plain Table 1" w:uiPriority="41"/>
     <w:lsdException w:name="Plain Table 2" w:uiPriority="42"/>
     <w:lsdException w:name="Plain Table 3" w:uiPriority="43"/>
@@ -480,49 +1113,15 @@
     <w:lsdException w:name="List Table 5 Dark Accent 6" w:uiPriority="50"/>
     <w:lsdException w:name="List Table 6 Colorful Accent 6" w:uiPriority="51"/>
     <w:lsdException w:name="List Table 7 Colorful Accent 6" w:uiPriority="52"/>
+    <w:lsdException w:name="Mention" w:semiHidden="1" w:unhideWhenUsed="1"/>
+    <w:lsdException w:name="Smart Hyperlink" w:semiHidden="1" w:unhideWhenUsed="1"/>
+    <w:lsdException w:name="Hashtag" w:semiHidden="1" w:unhideWhenUsed="1"/>
+    <w:lsdException w:name="Unresolved Mention" w:semiHidden="1" w:unhideWhenUsed="1"/>
+    <w:lsdException w:name="Smart Link" w:semiHidden="1" w:unhideWhenUsed="1"/>
   </w:latentStyles>
-  <w:style w:type="paragraph" w:styleId="Normal" w:default="1">
+  <w:style w:type="paragraph" w:default="1" w:styleId="Normal">
     <w:name w:val="Normal"/>
     <w:qFormat/>
-  </w:style>
-  <w:style w:type="character" w:styleId="DefaultParagraphFont" w:default="1">
-    <w:name w:val="Default Paragraph Font"/>
-    <w:uiPriority w:val="1"/>
-    <w:semiHidden/>
-    <w:unhideWhenUsed/>
-  </w:style>
-  <w:style w:type="table" w:styleId="TableNormal" w:default="1">
-    <w:name w:val="Normal Table"/>
-    <w:uiPriority w:val="99"/>
-    <w:semiHidden/>
-    <w:unhideWhenUsed/>
-    <w:tblPr>
-      <w:tblInd w:w="0" w:type="dxa"/>
-      <w:tblCellMar>
-        <w:top w:w="0" w:type="dxa"/>
-        <w:left w:w="108" w:type="dxa"/>
-        <w:bottom w:w="0" w:type="dxa"/>
-        <w:right w:w="108" w:type="dxa"/>
-      </w:tblCellMar>
-    </w:tblPr>
-  </w:style>
-  <w:style w:type="numbering" w:styleId="NoList" w:default="1">
-    <w:name w:val="No List"/>
-    <w:uiPriority w:val="99"/>
-    <w:semiHidden/>
-    <w:unhideWhenUsed/>
-  </w:style>
-  <w:style w:type="character" w:styleId="Heading1Char" w:customStyle="1">
-    <w:name w:val="Heading 1 Char"/>
-    <w:basedOn w:val="DefaultParagraphFont"/>
-    <w:link w:val="Heading1"/>
-    <w:uiPriority w:val="9"/>
-    <w:rPr>
-      <w:rFonts w:asciiTheme="majorHAnsi" w:hAnsiTheme="majorHAnsi" w:eastAsiaTheme="majorEastAsia" w:cstheme="majorBidi"/>
-      <w:color w:val="0F4761" w:themeColor="accent1" w:themeShade="BF"/>
-      <w:sz w:val="40"/>
-      <w:szCs w:val="40"/>
-    </w:rPr>
   </w:style>
   <w:style w:type="paragraph" w:styleId="Heading1">
     <w:name w:val="heading 1"/>
@@ -538,22 +1137,10 @@
       <w:outlineLvl w:val="0"/>
     </w:pPr>
     <w:rPr>
-      <w:rFonts w:asciiTheme="majorHAnsi" w:hAnsiTheme="majorHAnsi" w:eastAsiaTheme="majorEastAsia" w:cstheme="majorBidi"/>
+      <w:rFonts w:asciiTheme="majorHAnsi" w:eastAsiaTheme="majorEastAsia" w:hAnsiTheme="majorHAnsi" w:cstheme="majorBidi"/>
       <w:color w:val="0F4761" w:themeColor="accent1" w:themeShade="BF"/>
       <w:sz w:val="40"/>
       <w:szCs w:val="40"/>
-    </w:rPr>
-  </w:style>
-  <w:style w:type="character" w:styleId="Heading2Char" w:customStyle="1">
-    <w:name w:val="Heading 2 Char"/>
-    <w:basedOn w:val="DefaultParagraphFont"/>
-    <w:link w:val="Heading2"/>
-    <w:uiPriority w:val="9"/>
-    <w:rPr>
-      <w:rFonts w:asciiTheme="majorHAnsi" w:hAnsiTheme="majorHAnsi" w:eastAsiaTheme="majorEastAsia" w:cstheme="majorBidi"/>
-      <w:color w:val="0F4761" w:themeColor="accent1" w:themeShade="BF"/>
-      <w:sz w:val="32"/>
-      <w:szCs w:val="32"/>
     </w:rPr>
   </w:style>
   <w:style w:type="paragraph" w:styleId="Heading2">
@@ -571,22 +1158,10 @@
       <w:outlineLvl w:val="1"/>
     </w:pPr>
     <w:rPr>
-      <w:rFonts w:asciiTheme="majorHAnsi" w:hAnsiTheme="majorHAnsi" w:eastAsiaTheme="majorEastAsia" w:cstheme="majorBidi"/>
+      <w:rFonts w:asciiTheme="majorHAnsi" w:eastAsiaTheme="majorEastAsia" w:hAnsiTheme="majorHAnsi" w:cstheme="majorBidi"/>
       <w:color w:val="0F4761" w:themeColor="accent1" w:themeShade="BF"/>
       <w:sz w:val="32"/>
       <w:szCs w:val="32"/>
-    </w:rPr>
-  </w:style>
-  <w:style w:type="character" w:styleId="Heading3Char" w:customStyle="1">
-    <w:name w:val="Heading 3 Char"/>
-    <w:basedOn w:val="DefaultParagraphFont"/>
-    <w:link w:val="Heading3"/>
-    <w:uiPriority w:val="9"/>
-    <w:rPr>
-      <w:rFonts w:eastAsiaTheme="majorEastAsia" w:cstheme="majorBidi"/>
-      <w:color w:val="0F4761" w:themeColor="accent1" w:themeShade="BF"/>
-      <w:sz w:val="28"/>
-      <w:szCs w:val="28"/>
     </w:rPr>
   </w:style>
   <w:style w:type="paragraph" w:styleId="Heading3">
@@ -610,18 +1185,6 @@
       <w:szCs w:val="28"/>
     </w:rPr>
   </w:style>
-  <w:style w:type="character" w:styleId="Heading4Char" w:customStyle="1">
-    <w:name w:val="Heading 4 Char"/>
-    <w:basedOn w:val="DefaultParagraphFont"/>
-    <w:link w:val="Heading4"/>
-    <w:uiPriority w:val="9"/>
-    <w:rPr>
-      <w:rFonts w:eastAsiaTheme="majorEastAsia" w:cstheme="majorBidi"/>
-      <w:i/>
-      <w:iCs/>
-      <w:color w:val="0F4761" w:themeColor="accent1" w:themeShade="BF"/>
-    </w:rPr>
-  </w:style>
   <w:style w:type="paragraph" w:styleId="Heading4">
     <w:name w:val="heading 4"/>
     <w:basedOn w:val="Normal"/>
@@ -643,16 +1206,6 @@
       <w:color w:val="0F4761" w:themeColor="accent1" w:themeShade="BF"/>
     </w:rPr>
   </w:style>
-  <w:style w:type="character" w:styleId="Heading5Char" w:customStyle="1">
-    <w:name w:val="Heading 5 Char"/>
-    <w:basedOn w:val="DefaultParagraphFont"/>
-    <w:link w:val="Heading5"/>
-    <w:uiPriority w:val="9"/>
-    <w:rPr>
-      <w:rFonts w:eastAsiaTheme="majorEastAsia" w:cstheme="majorBidi"/>
-      <w:color w:val="0F4761" w:themeColor="accent1" w:themeShade="BF"/>
-    </w:rPr>
-  </w:style>
   <w:style w:type="paragraph" w:styleId="Heading5">
     <w:name w:val="heading 5"/>
     <w:basedOn w:val="Normal"/>
@@ -672,18 +1225,6 @@
       <w:color w:val="0F4761" w:themeColor="accent1" w:themeShade="BF"/>
     </w:rPr>
   </w:style>
-  <w:style w:type="character" w:styleId="Heading6Char" w:customStyle="1">
-    <w:name w:val="Heading 6 Char"/>
-    <w:basedOn w:val="DefaultParagraphFont"/>
-    <w:link w:val="Heading6"/>
-    <w:uiPriority w:val="9"/>
-    <w:rPr>
-      <w:rFonts w:eastAsiaTheme="majorEastAsia" w:cstheme="majorBidi"/>
-      <w:i/>
-      <w:iCs/>
-      <w:color w:val="595959" w:themeColor="text1" w:themeTint="A6"/>
-    </w:rPr>
-  </w:style>
   <w:style w:type="paragraph" w:styleId="Heading6">
     <w:name w:val="heading 6"/>
     <w:basedOn w:val="Normal"/>
@@ -705,16 +1246,6 @@
       <w:color w:val="595959" w:themeColor="text1" w:themeTint="A6"/>
     </w:rPr>
   </w:style>
-  <w:style w:type="character" w:styleId="Heading7Char" w:customStyle="1">
-    <w:name w:val="Heading 7 Char"/>
-    <w:basedOn w:val="DefaultParagraphFont"/>
-    <w:link w:val="Heading7"/>
-    <w:uiPriority w:val="9"/>
-    <w:rPr>
-      <w:rFonts w:eastAsiaTheme="majorEastAsia" w:cstheme="majorBidi"/>
-      <w:color w:val="595959" w:themeColor="text1" w:themeTint="A6"/>
-    </w:rPr>
-  </w:style>
   <w:style w:type="paragraph" w:styleId="Heading7">
     <w:name w:val="heading 7"/>
     <w:basedOn w:val="Normal"/>
@@ -734,18 +1265,6 @@
       <w:color w:val="595959" w:themeColor="text1" w:themeTint="A6"/>
     </w:rPr>
   </w:style>
-  <w:style w:type="character" w:styleId="Heading8Char" w:customStyle="1">
-    <w:name w:val="Heading 8 Char"/>
-    <w:basedOn w:val="DefaultParagraphFont"/>
-    <w:link w:val="Heading8"/>
-    <w:uiPriority w:val="9"/>
-    <w:rPr>
-      <w:rFonts w:eastAsiaTheme="majorEastAsia" w:cstheme="majorBidi"/>
-      <w:i/>
-      <w:iCs/>
-      <w:color w:val="272727" w:themeColor="text1" w:themeTint="D8"/>
-    </w:rPr>
-  </w:style>
   <w:style w:type="paragraph" w:styleId="Heading8">
     <w:name w:val="heading 8"/>
     <w:basedOn w:val="Normal"/>
@@ -767,16 +1286,6 @@
       <w:color w:val="272727" w:themeColor="text1" w:themeTint="D8"/>
     </w:rPr>
   </w:style>
-  <w:style w:type="character" w:styleId="Heading9Char" w:customStyle="1">
-    <w:name w:val="Heading 9 Char"/>
-    <w:basedOn w:val="DefaultParagraphFont"/>
-    <w:link w:val="Heading9"/>
-    <w:uiPriority w:val="9"/>
-    <w:rPr>
-      <w:rFonts w:eastAsiaTheme="majorEastAsia" w:cstheme="majorBidi"/>
-      <w:color w:val="272727" w:themeColor="text1" w:themeTint="D8"/>
-    </w:rPr>
-  </w:style>
   <w:style w:type="paragraph" w:styleId="Heading9">
     <w:name w:val="heading 9"/>
     <w:basedOn w:val="Normal"/>
@@ -796,13 +1305,142 @@
       <w:color w:val="272727" w:themeColor="text1" w:themeTint="D8"/>
     </w:rPr>
   </w:style>
-  <w:style w:type="character" w:styleId="TitleChar" w:customStyle="1">
+  <w:style w:type="character" w:default="1" w:styleId="DefaultParagraphFont">
+    <w:name w:val="Default Paragraph Font"/>
+    <w:uiPriority w:val="1"/>
+    <w:semiHidden/>
+    <w:unhideWhenUsed/>
+  </w:style>
+  <w:style w:type="table" w:default="1" w:styleId="TableNormal">
+    <w:name w:val="Normal Table"/>
+    <w:uiPriority w:val="99"/>
+    <w:semiHidden/>
+    <w:unhideWhenUsed/>
+    <w:tblPr>
+      <w:tblInd w:w="0" w:type="dxa"/>
+      <w:tblCellMar>
+        <w:top w:w="0" w:type="dxa"/>
+        <w:left w:w="108" w:type="dxa"/>
+        <w:bottom w:w="0" w:type="dxa"/>
+        <w:right w:w="108" w:type="dxa"/>
+      </w:tblCellMar>
+    </w:tblPr>
+  </w:style>
+  <w:style w:type="numbering" w:default="1" w:styleId="NoList">
+    <w:name w:val="No List"/>
+    <w:uiPriority w:val="99"/>
+    <w:semiHidden/>
+    <w:unhideWhenUsed/>
+  </w:style>
+  <w:style w:type="character" w:customStyle="1" w:styleId="Heading1Char">
+    <w:name w:val="Heading 1 Char"/>
+    <w:basedOn w:val="DefaultParagraphFont"/>
+    <w:link w:val="Heading1"/>
+    <w:uiPriority w:val="9"/>
+    <w:rPr>
+      <w:rFonts w:asciiTheme="majorHAnsi" w:eastAsiaTheme="majorEastAsia" w:hAnsiTheme="majorHAnsi" w:cstheme="majorBidi"/>
+      <w:color w:val="0F4761" w:themeColor="accent1" w:themeShade="BF"/>
+      <w:sz w:val="40"/>
+      <w:szCs w:val="40"/>
+    </w:rPr>
+  </w:style>
+  <w:style w:type="character" w:customStyle="1" w:styleId="Heading2Char">
+    <w:name w:val="Heading 2 Char"/>
+    <w:basedOn w:val="DefaultParagraphFont"/>
+    <w:link w:val="Heading2"/>
+    <w:uiPriority w:val="9"/>
+    <w:rPr>
+      <w:rFonts w:asciiTheme="majorHAnsi" w:eastAsiaTheme="majorEastAsia" w:hAnsiTheme="majorHAnsi" w:cstheme="majorBidi"/>
+      <w:color w:val="0F4761" w:themeColor="accent1" w:themeShade="BF"/>
+      <w:sz w:val="32"/>
+      <w:szCs w:val="32"/>
+    </w:rPr>
+  </w:style>
+  <w:style w:type="character" w:customStyle="1" w:styleId="Heading3Char">
+    <w:name w:val="Heading 3 Char"/>
+    <w:basedOn w:val="DefaultParagraphFont"/>
+    <w:link w:val="Heading3"/>
+    <w:uiPriority w:val="9"/>
+    <w:rPr>
+      <w:rFonts w:eastAsiaTheme="majorEastAsia" w:cstheme="majorBidi"/>
+      <w:color w:val="0F4761" w:themeColor="accent1" w:themeShade="BF"/>
+      <w:sz w:val="28"/>
+      <w:szCs w:val="28"/>
+    </w:rPr>
+  </w:style>
+  <w:style w:type="character" w:customStyle="1" w:styleId="Heading4Char">
+    <w:name w:val="Heading 4 Char"/>
+    <w:basedOn w:val="DefaultParagraphFont"/>
+    <w:link w:val="Heading4"/>
+    <w:uiPriority w:val="9"/>
+    <w:rPr>
+      <w:rFonts w:eastAsiaTheme="majorEastAsia" w:cstheme="majorBidi"/>
+      <w:i/>
+      <w:iCs/>
+      <w:color w:val="0F4761" w:themeColor="accent1" w:themeShade="BF"/>
+    </w:rPr>
+  </w:style>
+  <w:style w:type="character" w:customStyle="1" w:styleId="Heading5Char">
+    <w:name w:val="Heading 5 Char"/>
+    <w:basedOn w:val="DefaultParagraphFont"/>
+    <w:link w:val="Heading5"/>
+    <w:uiPriority w:val="9"/>
+    <w:rPr>
+      <w:rFonts w:eastAsiaTheme="majorEastAsia" w:cstheme="majorBidi"/>
+      <w:color w:val="0F4761" w:themeColor="accent1" w:themeShade="BF"/>
+    </w:rPr>
+  </w:style>
+  <w:style w:type="character" w:customStyle="1" w:styleId="Heading6Char">
+    <w:name w:val="Heading 6 Char"/>
+    <w:basedOn w:val="DefaultParagraphFont"/>
+    <w:link w:val="Heading6"/>
+    <w:uiPriority w:val="9"/>
+    <w:rPr>
+      <w:rFonts w:eastAsiaTheme="majorEastAsia" w:cstheme="majorBidi"/>
+      <w:i/>
+      <w:iCs/>
+      <w:color w:val="595959" w:themeColor="text1" w:themeTint="A6"/>
+    </w:rPr>
+  </w:style>
+  <w:style w:type="character" w:customStyle="1" w:styleId="Heading7Char">
+    <w:name w:val="Heading 7 Char"/>
+    <w:basedOn w:val="DefaultParagraphFont"/>
+    <w:link w:val="Heading7"/>
+    <w:uiPriority w:val="9"/>
+    <w:rPr>
+      <w:rFonts w:eastAsiaTheme="majorEastAsia" w:cstheme="majorBidi"/>
+      <w:color w:val="595959" w:themeColor="text1" w:themeTint="A6"/>
+    </w:rPr>
+  </w:style>
+  <w:style w:type="character" w:customStyle="1" w:styleId="Heading8Char">
+    <w:name w:val="Heading 8 Char"/>
+    <w:basedOn w:val="DefaultParagraphFont"/>
+    <w:link w:val="Heading8"/>
+    <w:uiPriority w:val="9"/>
+    <w:rPr>
+      <w:rFonts w:eastAsiaTheme="majorEastAsia" w:cstheme="majorBidi"/>
+      <w:i/>
+      <w:iCs/>
+      <w:color w:val="272727" w:themeColor="text1" w:themeTint="D8"/>
+    </w:rPr>
+  </w:style>
+  <w:style w:type="character" w:customStyle="1" w:styleId="Heading9Char">
+    <w:name w:val="Heading 9 Char"/>
+    <w:basedOn w:val="DefaultParagraphFont"/>
+    <w:link w:val="Heading9"/>
+    <w:uiPriority w:val="9"/>
+    <w:rPr>
+      <w:rFonts w:eastAsiaTheme="majorEastAsia" w:cstheme="majorBidi"/>
+      <w:color w:val="272727" w:themeColor="text1" w:themeTint="D8"/>
+    </w:rPr>
+  </w:style>
+  <w:style w:type="character" w:customStyle="1" w:styleId="TitleChar">
     <w:name w:val="Title Char"/>
     <w:basedOn w:val="DefaultParagraphFont"/>
     <w:link w:val="Title"/>
     <w:uiPriority w:val="10"/>
     <w:rPr>
-      <w:rFonts w:asciiTheme="majorHAnsi" w:hAnsiTheme="majorHAnsi" w:eastAsiaTheme="majorEastAsia" w:cstheme="majorBidi"/>
+      <w:rFonts w:asciiTheme="majorHAnsi" w:eastAsiaTheme="majorEastAsia" w:hAnsiTheme="majorHAnsi" w:cstheme="majorBidi"/>
       <w:spacing w:val="-10"/>
       <w:kern w:val="28"/>
       <w:sz w:val="56"/>
@@ -821,14 +1459,14 @@
       <w:contextualSpacing/>
     </w:pPr>
     <w:rPr>
-      <w:rFonts w:asciiTheme="majorHAnsi" w:hAnsiTheme="majorHAnsi" w:eastAsiaTheme="majorEastAsia" w:cstheme="majorBidi"/>
+      <w:rFonts w:asciiTheme="majorHAnsi" w:eastAsiaTheme="majorEastAsia" w:hAnsiTheme="majorHAnsi" w:cstheme="majorBidi"/>
       <w:spacing w:val="-10"/>
       <w:kern w:val="28"/>
       <w:sz w:val="56"/>
       <w:szCs w:val="56"/>
     </w:rPr>
   </w:style>
-  <w:style w:type="character" w:styleId="SubtitleChar" w:customStyle="1">
+  <w:style w:type="character" w:customStyle="1" w:styleId="SubtitleChar">
     <w:name w:val="Subtitle Char"/>
     <w:basedOn w:val="DefaultParagraphFont"/>
     <w:link w:val="Subtitle"/>
@@ -872,7 +1510,7 @@
       <w:color w:val="0F4761" w:themeColor="accent1" w:themeShade="BF"/>
     </w:rPr>
   </w:style>
-  <w:style w:type="character" w:styleId="QuoteChar" w:customStyle="1">
+  <w:style w:type="character" w:customStyle="1" w:styleId="QuoteChar">
     <w:name w:val="Quote Char"/>
     <w:basedOn w:val="DefaultParagraphFont"/>
     <w:link w:val="Quote"/>
@@ -900,7 +1538,7 @@
       <w:color w:val="404040" w:themeColor="text1" w:themeTint="BF"/>
     </w:rPr>
   </w:style>
-  <w:style w:type="character" w:styleId="IntenseQuoteChar" w:customStyle="1">
+  <w:style w:type="character" w:customStyle="1" w:styleId="IntenseQuoteChar">
     <w:name w:val="Intense Quote Char"/>
     <w:basedOn w:val="DefaultParagraphFont"/>
     <w:link w:val="IntenseQuote"/>
@@ -920,8 +1558,8 @@
     <w:qFormat/>
     <w:pPr>
       <w:pBdr>
-        <w:top w:val="single" w:color="0F4761" w:themeColor="accent1" w:themeShade="BF" w:sz="4" w:space="10"/>
-        <w:bottom w:val="single" w:color="0F4761" w:themeColor="accent1" w:themeShade="BF" w:sz="4" w:space="10"/>
+        <w:top w:val="single" w:sz="4" w:space="10" w:color="0F4761" w:themeColor="accent1" w:themeShade="BF"/>
+        <w:bottom w:val="single" w:sz="4" w:space="10" w:color="0F4761" w:themeColor="accent1" w:themeShade="BF"/>
       </w:pBdr>
       <w:spacing w:before="360" w:after="360"/>
       <w:ind w:left="864" w:right="864"/>
@@ -946,11 +1584,66 @@
       <w:spacing w:val="5"/>
     </w:rPr>
   </w:style>
+  <w:style w:type="paragraph" w:styleId="Header">
+    <w:name w:val="header"/>
+    <w:basedOn w:val="Normal"/>
+    <w:link w:val="HeaderChar"/>
+    <w:uiPriority w:val="99"/>
+    <w:unhideWhenUsed/>
+    <w:rsid w:val="00980C70"/>
+    <w:pPr>
+      <w:tabs>
+        <w:tab w:val="center" w:pos="4680"/>
+        <w:tab w:val="right" w:pos="9360"/>
+      </w:tabs>
+      <w:spacing w:after="0" w:line="240" w:lineRule="auto"/>
+    </w:pPr>
+  </w:style>
+  <w:style w:type="character" w:customStyle="1" w:styleId="HeaderChar">
+    <w:name w:val="Header Char"/>
+    <w:basedOn w:val="DefaultParagraphFont"/>
+    <w:link w:val="Header"/>
+    <w:uiPriority w:val="99"/>
+    <w:rsid w:val="00980C70"/>
+  </w:style>
+  <w:style w:type="paragraph" w:styleId="Footer">
+    <w:name w:val="footer"/>
+    <w:basedOn w:val="Normal"/>
+    <w:link w:val="FooterChar"/>
+    <w:uiPriority w:val="99"/>
+    <w:unhideWhenUsed/>
+    <w:rsid w:val="00980C70"/>
+    <w:pPr>
+      <w:tabs>
+        <w:tab w:val="center" w:pos="4680"/>
+        <w:tab w:val="right" w:pos="9360"/>
+      </w:tabs>
+      <w:spacing w:after="0" w:line="240" w:lineRule="auto"/>
+    </w:pPr>
+  </w:style>
+  <w:style w:type="character" w:customStyle="1" w:styleId="FooterChar">
+    <w:name w:val="Footer Char"/>
+    <w:basedOn w:val="DefaultParagraphFont"/>
+    <w:link w:val="Footer"/>
+    <w:uiPriority w:val="99"/>
+    <w:rsid w:val="00980C70"/>
+  </w:style>
+  <w:style w:type="paragraph" w:styleId="ListParagraph">
+    <w:name w:val="List Paragraph"/>
+    <w:basedOn w:val="Normal"/>
+    <w:uiPriority w:val="34"/>
+    <w:qFormat/>
+    <w:rsid w:val="00125E09"/>
+    <w:pPr>
+      <w:ind w:left="720"/>
+      <w:contextualSpacing/>
+    </w:pPr>
+  </w:style>
 </w:styles>
 </file>
 
 <file path=word/theme/theme1.xml><?xml version="1.0" encoding="utf-8"?>
-<a:theme xmlns:thm15="http://schemas.microsoft.com/office/thememl/2012/main" xmlns:a="http://schemas.openxmlformats.org/drawingml/2006/main" name="Office Theme">
+<a:theme xmlns:a="http://schemas.openxmlformats.org/drawingml/2006/main" name="Office Theme">
   <a:themeElements>
     <a:clrScheme name="Office">
       <a:dk1>

</xml_diff>